<commit_message>
docs: fault-check limitations and a description of every installation method
- Report limitations: the k^2 S^2 >= I^2t let-through check for devices faster than 0.1 s
  or current-limiting is not calculated; the fault pair entered must be the worst one
  along the cable (IS 732 clause 4.4.5.5.2).
- Template Guide sheet: a short description of each installation method (A1 to D2) and
  the grouping row the tool applies, from IS 732 Tables 19, 20, 36-38 and clause S-6.1.
- SOURCES.md: method codes checked item by item against IEC Table A.52.3; the same in both.
- Sample input and report regenerated.

Co-Authored-By: Claude Opus 5 (1M context) <noreply@anthropic.com>
</commit_message>
<xml_diff>
--- a/samples/sample-report.docx
+++ b/samples/sample-report.docx
@@ -60,7 +60,7 @@
           </w:tcPr>
           <w:p>
             <w:r>
-              <w:t>2026-09-21</w:t>
+              <w:t>2026-09-22</w:t>
             </w:r>
           </w:p>
         </w:tc>
@@ -3642,6 +3642,16 @@
     </w:p>
     <w:p>
       <w:r>
+        <w:t>Short-circuit withstand is checked as S &gt;= I x sqrt(t) / k (IS 732 clause 4.4.5.5.2, equation 3). The same clause requires k^2 x S^2 to exceed the let-through energy I^2t quoted by the device manufacturer where the device operates in less than 0.1 s or is current-limiting. That check is not calculated; the engineer must make it from the manufacturer's data.</w:t>
+      </w:r>
+    </w:p>
+    <w:p>
+      <w:r>
+        <w:t>The fault current and fault time entered must be the worst pair for a fault anywhere along the cable (IS 732 clause 4.4.5.5.2). A fault at the far end is smaller but may take longer to clear, so it can be the more onerous case. The tool checks only the pair entered.</w:t>
+      </w:r>
+    </w:p>
+    <w:p>
+      <w:r>
         <w:t>Harmonic derating is not calculated.</w:t>
       </w:r>
     </w:p>

</xml_diff>

<commit_message>
feat: cable construction drop-down replaces the cores column
Manas's own test entered cores = 1 meaning single-core cables; the tool meant loaded
conductors and stopped with an engine error that named no row (spec Rev3).

- Input: `cable` drop-down (2 x 1C, 3 x 1C, 4 x 1C, 2C, 3C, 3.5C, 4C). Loaded conductors
  come from phase (IS 732 clause 5.2.6.6.1). Refused, by row: cable/phase mismatch,
  single-core with method E (F/G not covered) and with A2 (use A1).
- Every engine error is reported as Row n (tag), all cables at once.
- Report: heading and summary show the construction; limitation lines for parallel runs,
  F/G, and the 3.5C reduced neutral.
- Worked examples gain a cable value; no calculated value changes.
- README gains the fault-check limitations missed in PR #12. Samples regenerated.

Co-Authored-By: Claude Opus 5 (1M context) <noreply@anthropic.com>
</commit_message>
<xml_diff>
--- a/samples/sample-report.docx
+++ b/samples/sample-report.docx
@@ -142,7 +142,7 @@
         <w:pStyle w:val="Heading1"/>
       </w:pPr>
       <w:r>
-        <w:t>Cable F-01 Pump motor</w:t>
+        <w:t>Cable F-01 Pump motor: 3C x 16 mm2 Cu PVC</w:t>
       </w:r>
     </w:p>
     <w:p>
@@ -762,7 +762,7 @@
         <w:pStyle w:val="Heading1"/>
       </w:pPr>
       <w:r>
-        <w:t>Cable F-02 Yard lighting</w:t>
+        <w:t>Cable F-02 Yard lighting: 2 x 1C x 6 mm2 Cu PVC</w:t>
       </w:r>
     </w:p>
     <w:p>
@@ -1382,7 +1382,7 @@
         <w:pStyle w:val="Heading1"/>
       </w:pPr>
       <w:r>
-        <w:t>Cable F-03 Board tail</w:t>
+        <w:t>Cable F-03 Board tail: 4C x 120 mm2 Cu XLPE</w:t>
       </w:r>
     </w:p>
     <w:p>
@@ -2002,7 +2002,7 @@
         <w:pStyle w:val="Heading1"/>
       </w:pPr>
       <w:r>
-        <w:t>Cable F-04 Store building</w:t>
+        <w:t>Cable F-04 Store building: 3.5C x 185 mm2 Al XLPE</w:t>
       </w:r>
     </w:p>
     <w:p>
@@ -2624,7 +2624,7 @@
         <w:pStyle w:val="Heading1"/>
       </w:pPr>
       <w:r>
-        <w:t>Cable F-05 Main incomer</w:t>
+        <w:t>Cable F-05 Main incomer: 4 x 1C Cu PVC, no size passes</w:t>
       </w:r>
     </w:p>
     <w:p>
@@ -3254,10 +3254,11 @@
         <w:tblLook w:firstColumn="1" w:firstRow="1" w:lastColumn="0" w:lastRow="0" w:noHBand="0" w:noVBand="1" w:val="04A0"/>
       </w:tblPr>
       <w:tblGrid>
-        <w:gridCol w:w="2160"/>
-        <w:gridCol w:w="2160"/>
-        <w:gridCol w:w="2160"/>
-        <w:gridCol w:w="2160"/>
+        <w:gridCol w:w="1728"/>
+        <w:gridCol w:w="1728"/>
+        <w:gridCol w:w="1728"/>
+        <w:gridCol w:w="1728"/>
+        <w:gridCol w:w="1728"/>
       </w:tblGrid>
       <w:tr>
         <w:trPr>
@@ -3265,7 +3266,7 @@
         </w:trPr>
         <w:tc>
           <w:tcPr>
-            <w:tcW w:type="dxa" w:w="2160"/>
+            <w:tcW w:type="dxa" w:w="1728"/>
           </w:tcPr>
           <w:p>
             <w:pPr>
@@ -3278,7 +3279,20 @@
         </w:tc>
         <w:tc>
           <w:tcPr>
-            <w:tcW w:type="dxa" w:w="2160"/>
+            <w:tcW w:type="dxa" w:w="1728"/>
+          </w:tcPr>
+          <w:p>
+            <w:pPr>
+              <w:keepNext/>
+            </w:pPr>
+            <w:r>
+              <w:t>Construction</w:t>
+            </w:r>
+          </w:p>
+        </w:tc>
+        <w:tc>
+          <w:tcPr>
+            <w:tcW w:type="dxa" w:w="1728"/>
           </w:tcPr>
           <w:p>
             <w:pPr>
@@ -3291,7 +3305,7 @@
         </w:tc>
         <w:tc>
           <w:tcPr>
-            <w:tcW w:type="dxa" w:w="2160"/>
+            <w:tcW w:type="dxa" w:w="1728"/>
           </w:tcPr>
           <w:p>
             <w:pPr>
@@ -3304,7 +3318,7 @@
         </w:tc>
         <w:tc>
           <w:tcPr>
-            <w:tcW w:type="dxa" w:w="2160"/>
+            <w:tcW w:type="dxa" w:w="1728"/>
           </w:tcPr>
           <w:p>
             <w:pPr>
@@ -3322,7 +3336,7 @@
         </w:trPr>
         <w:tc>
           <w:tcPr>
-            <w:tcW w:type="dxa" w:w="2160"/>
+            <w:tcW w:type="dxa" w:w="1728"/>
           </w:tcPr>
           <w:p>
             <w:pPr>
@@ -3335,7 +3349,20 @@
         </w:tc>
         <w:tc>
           <w:tcPr>
-            <w:tcW w:type="dxa" w:w="2160"/>
+            <w:tcW w:type="dxa" w:w="1728"/>
+          </w:tcPr>
+          <w:p>
+            <w:pPr>
+              <w:keepNext/>
+            </w:pPr>
+            <w:r>
+              <w:t>3C Cu PVC</w:t>
+            </w:r>
+          </w:p>
+        </w:tc>
+        <w:tc>
+          <w:tcPr>
+            <w:tcW w:type="dxa" w:w="1728"/>
           </w:tcPr>
           <w:p>
             <w:pPr>
@@ -3348,7 +3375,7 @@
         </w:tc>
         <w:tc>
           <w:tcPr>
-            <w:tcW w:type="dxa" w:w="2160"/>
+            <w:tcW w:type="dxa" w:w="1728"/>
           </w:tcPr>
           <w:p>
             <w:pPr>
@@ -3361,7 +3388,7 @@
         </w:tc>
         <w:tc>
           <w:tcPr>
-            <w:tcW w:type="dxa" w:w="2160"/>
+            <w:tcW w:type="dxa" w:w="1728"/>
           </w:tcPr>
           <w:p>
             <w:pPr>
@@ -3379,7 +3406,7 @@
         </w:trPr>
         <w:tc>
           <w:tcPr>
-            <w:tcW w:type="dxa" w:w="2160"/>
+            <w:tcW w:type="dxa" w:w="1728"/>
           </w:tcPr>
           <w:p>
             <w:pPr>
@@ -3392,7 +3419,20 @@
         </w:tc>
         <w:tc>
           <w:tcPr>
-            <w:tcW w:type="dxa" w:w="2160"/>
+            <w:tcW w:type="dxa" w:w="1728"/>
+          </w:tcPr>
+          <w:p>
+            <w:pPr>
+              <w:keepNext/>
+            </w:pPr>
+            <w:r>
+              <w:t>2 x 1C Cu PVC</w:t>
+            </w:r>
+          </w:p>
+        </w:tc>
+        <w:tc>
+          <w:tcPr>
+            <w:tcW w:type="dxa" w:w="1728"/>
           </w:tcPr>
           <w:p>
             <w:pPr>
@@ -3405,7 +3445,7 @@
         </w:tc>
         <w:tc>
           <w:tcPr>
-            <w:tcW w:type="dxa" w:w="2160"/>
+            <w:tcW w:type="dxa" w:w="1728"/>
           </w:tcPr>
           <w:p>
             <w:pPr>
@@ -3418,7 +3458,7 @@
         </w:tc>
         <w:tc>
           <w:tcPr>
-            <w:tcW w:type="dxa" w:w="2160"/>
+            <w:tcW w:type="dxa" w:w="1728"/>
           </w:tcPr>
           <w:p>
             <w:pPr>
@@ -3436,7 +3476,7 @@
         </w:trPr>
         <w:tc>
           <w:tcPr>
-            <w:tcW w:type="dxa" w:w="2160"/>
+            <w:tcW w:type="dxa" w:w="1728"/>
           </w:tcPr>
           <w:p>
             <w:pPr>
@@ -3449,7 +3489,20 @@
         </w:tc>
         <w:tc>
           <w:tcPr>
-            <w:tcW w:type="dxa" w:w="2160"/>
+            <w:tcW w:type="dxa" w:w="1728"/>
+          </w:tcPr>
+          <w:p>
+            <w:pPr>
+              <w:keepNext/>
+            </w:pPr>
+            <w:r>
+              <w:t>4C Cu XLPE</w:t>
+            </w:r>
+          </w:p>
+        </w:tc>
+        <w:tc>
+          <w:tcPr>
+            <w:tcW w:type="dxa" w:w="1728"/>
           </w:tcPr>
           <w:p>
             <w:pPr>
@@ -3462,7 +3515,7 @@
         </w:tc>
         <w:tc>
           <w:tcPr>
-            <w:tcW w:type="dxa" w:w="2160"/>
+            <w:tcW w:type="dxa" w:w="1728"/>
           </w:tcPr>
           <w:p>
             <w:pPr>
@@ -3475,7 +3528,7 @@
         </w:tc>
         <w:tc>
           <w:tcPr>
-            <w:tcW w:type="dxa" w:w="2160"/>
+            <w:tcW w:type="dxa" w:w="1728"/>
           </w:tcPr>
           <w:p>
             <w:pPr>
@@ -3493,7 +3546,7 @@
         </w:trPr>
         <w:tc>
           <w:tcPr>
-            <w:tcW w:type="dxa" w:w="2160"/>
+            <w:tcW w:type="dxa" w:w="1728"/>
           </w:tcPr>
           <w:p>
             <w:pPr>
@@ -3506,7 +3559,20 @@
         </w:tc>
         <w:tc>
           <w:tcPr>
-            <w:tcW w:type="dxa" w:w="2160"/>
+            <w:tcW w:type="dxa" w:w="1728"/>
+          </w:tcPr>
+          <w:p>
+            <w:pPr>
+              <w:keepNext/>
+            </w:pPr>
+            <w:r>
+              <w:t>3.5C Al XLPE</w:t>
+            </w:r>
+          </w:p>
+        </w:tc>
+        <w:tc>
+          <w:tcPr>
+            <w:tcW w:type="dxa" w:w="1728"/>
           </w:tcPr>
           <w:p>
             <w:pPr>
@@ -3519,7 +3585,7 @@
         </w:tc>
         <w:tc>
           <w:tcPr>
-            <w:tcW w:type="dxa" w:w="2160"/>
+            <w:tcW w:type="dxa" w:w="1728"/>
           </w:tcPr>
           <w:p>
             <w:pPr>
@@ -3532,7 +3598,7 @@
         </w:tc>
         <w:tc>
           <w:tcPr>
-            <w:tcW w:type="dxa" w:w="2160"/>
+            <w:tcW w:type="dxa" w:w="1728"/>
           </w:tcPr>
           <w:p>
             <w:pPr>
@@ -3550,7 +3616,7 @@
         </w:trPr>
         <w:tc>
           <w:tcPr>
-            <w:tcW w:type="dxa" w:w="2160"/>
+            <w:tcW w:type="dxa" w:w="1728"/>
           </w:tcPr>
           <w:p>
             <w:pPr>
@@ -3563,7 +3629,20 @@
         </w:tc>
         <w:tc>
           <w:tcPr>
-            <w:tcW w:type="dxa" w:w="2160"/>
+            <w:tcW w:type="dxa" w:w="1728"/>
+          </w:tcPr>
+          <w:p>
+            <w:pPr>
+              <w:keepNext/>
+            </w:pPr>
+            <w:r>
+              <w:t>4 x 1C Cu PVC</w:t>
+            </w:r>
+          </w:p>
+        </w:tc>
+        <w:tc>
+          <w:tcPr>
+            <w:tcW w:type="dxa" w:w="1728"/>
           </w:tcPr>
           <w:p>
             <w:pPr>
@@ -3576,7 +3655,7 @@
         </w:tc>
         <w:tc>
           <w:tcPr>
-            <w:tcW w:type="dxa" w:w="2160"/>
+            <w:tcW w:type="dxa" w:w="1728"/>
           </w:tcPr>
           <w:p>
             <w:pPr>
@@ -3589,7 +3668,7 @@
         </w:tc>
         <w:tc>
           <w:tcPr>
-            <w:tcW w:type="dxa" w:w="2160"/>
+            <w:tcW w:type="dxa" w:w="1728"/>
           </w:tcPr>
           <w:p>
             <w:pPr>
@@ -3648,6 +3727,16 @@
     <w:p>
       <w:r>
         <w:t>The fault current and fault time entered must be the worst pair for a fault anywhere along the cable (IS 732 clause 4.4.5.5.2). A fault at the far end is smaller but may take longer to clear, so it can be the more onerous case. The tool checks only the pair entered.</w:t>
+      </w:r>
+    </w:p>
+    <w:p>
+      <w:r>
+        <w:t>Each cable is one run per phase. Cables in parallel are not covered, and neither are single-core cables in free air (methods F and G).</w:t>
+      </w:r>
+    </w:p>
+    <w:p>
+      <w:r>
+        <w:t>For a 3.5C cable the size given is that of the phase conductors; the reduced neutral follows the cable standard.</w:t>
       </w:r>
     </w:p>
     <w:p>

</xml_diff>

<commit_message>
feat: symbols table at the start of every report
Manas asked what It meant in a check line. Every short form used in the check tables
(Ib, In, It, Ca, Cs, Cg, Iz, dU, b, L, R, X, cos phi, S, I, t, k) is now defined in a
Symbols table after the cover details, including the reference conditions behind It.
Sample report regenerated (8 pages).

Co-Authored-By: Claude Opus 5 (1M context) <noreply@anthropic.com>
</commit_message>
<xml_diff>
--- a/samples/sample-report.docx
+++ b/samples/sample-report.docx
@@ -137,6 +137,516 @@
         <w:t>Checked by: ____________________</w:t>
       </w:r>
     </w:p>
+    <w:p>
+      <w:pPr>
+        <w:pStyle w:val="Heading1"/>
+      </w:pPr>
+      <w:r>
+        <w:t>Symbols</w:t>
+      </w:r>
+    </w:p>
+    <w:tbl>
+      <w:tblPr>
+        <w:tblStyle w:val="TableGrid"/>
+        <w:tblW w:type="auto" w:w="0"/>
+        <w:tblLayout w:type="fixed"/>
+        <w:tblLook w:firstColumn="1" w:firstRow="1" w:lastColumn="0" w:lastRow="0" w:noHBand="0" w:noVBand="1" w:val="04A0"/>
+      </w:tblPr>
+      <w:tblGrid>
+        <w:gridCol w:w="4320"/>
+        <w:gridCol w:w="4320"/>
+      </w:tblGrid>
+      <w:tr>
+        <w:trPr>
+          <w:cantSplit/>
+        </w:trPr>
+        <w:tc>
+          <w:tcPr>
+            <w:tcW w:type="dxa" w:w="1984"/>
+          </w:tcPr>
+          <w:p>
+            <w:pPr>
+              <w:keepNext/>
+            </w:pPr>
+            <w:r>
+              <w:t>Ib</w:t>
+            </w:r>
+          </w:p>
+        </w:tc>
+        <w:tc>
+          <w:tcPr>
+            <w:tcW w:type="dxa" w:w="7087"/>
+          </w:tcPr>
+          <w:p>
+            <w:pPr>
+              <w:keepNext/>
+            </w:pPr>
+            <w:r>
+              <w:t>Design current: the current the load draws (A).</w:t>
+            </w:r>
+          </w:p>
+        </w:tc>
+      </w:tr>
+      <w:tr>
+        <w:trPr>
+          <w:cantSplit/>
+        </w:trPr>
+        <w:tc>
+          <w:tcPr>
+            <w:tcW w:type="dxa" w:w="1984"/>
+          </w:tcPr>
+          <w:p>
+            <w:pPr>
+              <w:keepNext/>
+            </w:pPr>
+            <w:r>
+              <w:t>In</w:t>
+            </w:r>
+          </w:p>
+        </w:tc>
+        <w:tc>
+          <w:tcPr>
+            <w:tcW w:type="dxa" w:w="7087"/>
+          </w:tcPr>
+          <w:p>
+            <w:pPr>
+              <w:keepNext/>
+            </w:pPr>
+            <w:r>
+              <w:t>Rated current of the overload protective device (A); none if no device was entered.</w:t>
+            </w:r>
+          </w:p>
+        </w:tc>
+      </w:tr>
+      <w:tr>
+        <w:trPr>
+          <w:cantSplit/>
+        </w:trPr>
+        <w:tc>
+          <w:tcPr>
+            <w:tcW w:type="dxa" w:w="1984"/>
+          </w:tcPr>
+          <w:p>
+            <w:pPr>
+              <w:keepNext/>
+            </w:pPr>
+            <w:r>
+              <w:t>It</w:t>
+            </w:r>
+          </w:p>
+        </w:tc>
+        <w:tc>
+          <w:tcPr>
+            <w:tcW w:type="dxa" w:w="7087"/>
+          </w:tcPr>
+          <w:p>
+            <w:pPr>
+              <w:keepNext/>
+            </w:pPr>
+            <w:r>
+              <w:t>Tabulated current-carrying capacity: the rating read from the code's table for this size, conductor, insulation, installation method and number of loaded conductors, under the table's reference conditions of 30 deg C air or 20 deg C ground, soil thermal resistivity 2.5 K.m/W and one circuit on its own (A).</w:t>
+            </w:r>
+          </w:p>
+        </w:tc>
+      </w:tr>
+      <w:tr>
+        <w:trPr>
+          <w:cantSplit/>
+        </w:trPr>
+        <w:tc>
+          <w:tcPr>
+            <w:tcW w:type="dxa" w:w="1984"/>
+          </w:tcPr>
+          <w:p>
+            <w:pPr>
+              <w:keepNext/>
+            </w:pPr>
+            <w:r>
+              <w:t>Ca</w:t>
+            </w:r>
+          </w:p>
+        </w:tc>
+        <w:tc>
+          <w:tcPr>
+            <w:tcW w:type="dxa" w:w="7087"/>
+          </w:tcPr>
+          <w:p>
+            <w:pPr>
+              <w:keepNext/>
+            </w:pPr>
+            <w:r>
+              <w:t>Correction factor for the air temperature, or for the ground temperature for buried cables.</w:t>
+            </w:r>
+          </w:p>
+        </w:tc>
+      </w:tr>
+      <w:tr>
+        <w:trPr>
+          <w:cantSplit/>
+        </w:trPr>
+        <w:tc>
+          <w:tcPr>
+            <w:tcW w:type="dxa" w:w="1984"/>
+          </w:tcPr>
+          <w:p>
+            <w:pPr>
+              <w:keepNext/>
+            </w:pPr>
+            <w:r>
+              <w:t>Cs</w:t>
+            </w:r>
+          </w:p>
+        </w:tc>
+        <w:tc>
+          <w:tcPr>
+            <w:tcW w:type="dxa" w:w="7087"/>
+          </w:tcPr>
+          <w:p>
+            <w:pPr>
+              <w:keepNext/>
+            </w:pPr>
+            <w:r>
+              <w:t>Correction factor for the soil thermal resistivity (buried cables only).</w:t>
+            </w:r>
+          </w:p>
+        </w:tc>
+      </w:tr>
+      <w:tr>
+        <w:trPr>
+          <w:cantSplit/>
+        </w:trPr>
+        <w:tc>
+          <w:tcPr>
+            <w:tcW w:type="dxa" w:w="1984"/>
+          </w:tcPr>
+          <w:p>
+            <w:pPr>
+              <w:keepNext/>
+            </w:pPr>
+            <w:r>
+              <w:t>Cg</w:t>
+            </w:r>
+          </w:p>
+        </w:tc>
+        <w:tc>
+          <w:tcPr>
+            <w:tcW w:type="dxa" w:w="7087"/>
+          </w:tcPr>
+          <w:p>
+            <w:pPr>
+              <w:keepNext/>
+            </w:pPr>
+            <w:r>
+              <w:t>Group reduction factor for the other circuits run alongside.</w:t>
+            </w:r>
+          </w:p>
+        </w:tc>
+      </w:tr>
+      <w:tr>
+        <w:trPr>
+          <w:cantSplit/>
+        </w:trPr>
+        <w:tc>
+          <w:tcPr>
+            <w:tcW w:type="dxa" w:w="1984"/>
+          </w:tcPr>
+          <w:p>
+            <w:pPr>
+              <w:keepNext/>
+            </w:pPr>
+            <w:r>
+              <w:t>Iz</w:t>
+            </w:r>
+          </w:p>
+        </w:tc>
+        <w:tc>
+          <w:tcPr>
+            <w:tcW w:type="dxa" w:w="7087"/>
+          </w:tcPr>
+          <w:p>
+            <w:pPr>
+              <w:keepNext/>
+            </w:pPr>
+            <w:r>
+              <w:t>Current-carrying capacity in the actual installation: It multiplied by the correction factors (A). It must be at least Ib, and at least In where a device is entered.</w:t>
+            </w:r>
+          </w:p>
+        </w:tc>
+      </w:tr>
+      <w:tr>
+        <w:trPr>
+          <w:cantSplit/>
+        </w:trPr>
+        <w:tc>
+          <w:tcPr>
+            <w:tcW w:type="dxa" w:w="1984"/>
+          </w:tcPr>
+          <w:p>
+            <w:pPr>
+              <w:keepNext/>
+            </w:pPr>
+            <w:r>
+              <w:t>dU</w:t>
+            </w:r>
+          </w:p>
+        </w:tc>
+        <w:tc>
+          <w:tcPr>
+            <w:tcW w:type="dxa" w:w="7087"/>
+          </w:tcPr>
+          <w:p>
+            <w:pPr>
+              <w:keepNext/>
+            </w:pPr>
+            <w:r>
+              <w:t>Voltage drop along the cable (V), also given as a percentage of the supply voltage.</w:t>
+            </w:r>
+          </w:p>
+        </w:tc>
+      </w:tr>
+      <w:tr>
+        <w:trPr>
+          <w:cantSplit/>
+        </w:trPr>
+        <w:tc>
+          <w:tcPr>
+            <w:tcW w:type="dxa" w:w="1984"/>
+          </w:tcPr>
+          <w:p>
+            <w:pPr>
+              <w:keepNext/>
+            </w:pPr>
+            <w:r>
+              <w:t>b</w:t>
+            </w:r>
+          </w:p>
+        </w:tc>
+        <w:tc>
+          <w:tcPr>
+            <w:tcW w:type="dxa" w:w="7087"/>
+          </w:tcPr>
+          <w:p>
+            <w:pPr>
+              <w:keepNext/>
+            </w:pPr>
+            <w:r>
+              <w:t>Circuit factor: sqrt(3) for three-phase (on the line voltage), 2 for single-phase.</w:t>
+            </w:r>
+          </w:p>
+        </w:tc>
+      </w:tr>
+      <w:tr>
+        <w:trPr>
+          <w:cantSplit/>
+        </w:trPr>
+        <w:tc>
+          <w:tcPr>
+            <w:tcW w:type="dxa" w:w="1984"/>
+          </w:tcPr>
+          <w:p>
+            <w:pPr>
+              <w:keepNext/>
+            </w:pPr>
+            <w:r>
+              <w:t>L</w:t>
+            </w:r>
+          </w:p>
+        </w:tc>
+        <w:tc>
+          <w:tcPr>
+            <w:tcW w:type="dxa" w:w="7087"/>
+          </w:tcPr>
+          <w:p>
+            <w:pPr>
+              <w:keepNext/>
+            </w:pPr>
+            <w:r>
+              <w:t>Route length, one way (m).</w:t>
+            </w:r>
+          </w:p>
+        </w:tc>
+      </w:tr>
+      <w:tr>
+        <w:trPr>
+          <w:cantSplit/>
+        </w:trPr>
+        <w:tc>
+          <w:tcPr>
+            <w:tcW w:type="dxa" w:w="1984"/>
+          </w:tcPr>
+          <w:p>
+            <w:pPr>
+              <w:keepNext/>
+            </w:pPr>
+            <w:r>
+              <w:t>R, X</w:t>
+            </w:r>
+          </w:p>
+        </w:tc>
+        <w:tc>
+          <w:tcPr>
+            <w:tcW w:type="dxa" w:w="7087"/>
+          </w:tcPr>
+          <w:p>
+            <w:pPr>
+              <w:keepNext/>
+            </w:pPr>
+            <w:r>
+              <w:t>Resistance and reactance of the conductor per kilometre (ohm/km).</w:t>
+            </w:r>
+          </w:p>
+        </w:tc>
+      </w:tr>
+      <w:tr>
+        <w:trPr>
+          <w:cantSplit/>
+        </w:trPr>
+        <w:tc>
+          <w:tcPr>
+            <w:tcW w:type="dxa" w:w="1984"/>
+          </w:tcPr>
+          <w:p>
+            <w:pPr>
+              <w:keepNext/>
+            </w:pPr>
+            <w:r>
+              <w:t>cos phi, sin phi</w:t>
+            </w:r>
+          </w:p>
+        </w:tc>
+        <w:tc>
+          <w:tcPr>
+            <w:tcW w:type="dxa" w:w="7087"/>
+          </w:tcPr>
+          <w:p>
+            <w:pPr>
+              <w:keepNext/>
+            </w:pPr>
+            <w:r>
+              <w:t>cos phi is the power factor of the load; sin phi = sqrt(1 - cos phi^2).</w:t>
+            </w:r>
+          </w:p>
+        </w:tc>
+      </w:tr>
+      <w:tr>
+        <w:trPr>
+          <w:cantSplit/>
+        </w:trPr>
+        <w:tc>
+          <w:tcPr>
+            <w:tcW w:type="dxa" w:w="1984"/>
+          </w:tcPr>
+          <w:p>
+            <w:pPr>
+              <w:keepNext/>
+            </w:pPr>
+            <w:r>
+              <w:t>S</w:t>
+            </w:r>
+          </w:p>
+        </w:tc>
+        <w:tc>
+          <w:tcPr>
+            <w:tcW w:type="dxa" w:w="7087"/>
+          </w:tcPr>
+          <w:p>
+            <w:pPr>
+              <w:keepNext/>
+            </w:pPr>
+            <w:r>
+              <w:t>Cross-sectional area of the conductor (mm2).</w:t>
+            </w:r>
+          </w:p>
+        </w:tc>
+      </w:tr>
+      <w:tr>
+        <w:trPr>
+          <w:cantSplit/>
+        </w:trPr>
+        <w:tc>
+          <w:tcPr>
+            <w:tcW w:type="dxa" w:w="1984"/>
+          </w:tcPr>
+          <w:p>
+            <w:pPr>
+              <w:keepNext/>
+            </w:pPr>
+            <w:r>
+              <w:t>I</w:t>
+            </w:r>
+          </w:p>
+        </w:tc>
+        <w:tc>
+          <w:tcPr>
+            <w:tcW w:type="dxa" w:w="7087"/>
+          </w:tcPr>
+          <w:p>
+            <w:pPr>
+              <w:keepNext/>
+            </w:pPr>
+            <w:r>
+              <w:t>Prospective short-circuit current at the cable (kA).</w:t>
+            </w:r>
+          </w:p>
+        </w:tc>
+      </w:tr>
+      <w:tr>
+        <w:trPr>
+          <w:cantSplit/>
+        </w:trPr>
+        <w:tc>
+          <w:tcPr>
+            <w:tcW w:type="dxa" w:w="1984"/>
+          </w:tcPr>
+          <w:p>
+            <w:pPr>
+              <w:keepNext/>
+            </w:pPr>
+            <w:r>
+              <w:t>t</w:t>
+            </w:r>
+          </w:p>
+        </w:tc>
+        <w:tc>
+          <w:tcPr>
+            <w:tcW w:type="dxa" w:w="7087"/>
+          </w:tcPr>
+          <w:p>
+            <w:pPr>
+              <w:keepNext/>
+            </w:pPr>
+            <w:r>
+              <w:t>Time for the protective device to clear that fault (s).</w:t>
+            </w:r>
+          </w:p>
+        </w:tc>
+      </w:tr>
+      <w:tr>
+        <w:trPr>
+          <w:cantSplit/>
+        </w:trPr>
+        <w:tc>
+          <w:tcPr>
+            <w:tcW w:type="dxa" w:w="1984"/>
+          </w:tcPr>
+          <w:p>
+            <w:r>
+              <w:t>k</w:t>
+            </w:r>
+          </w:p>
+        </w:tc>
+        <w:tc>
+          <w:tcPr>
+            <w:tcW w:type="dxa" w:w="7087"/>
+          </w:tcPr>
+          <w:p>
+            <w:r>
+              <w:t>Factor for the conductor and insulation, from IS 732 Table 3.</w:t>
+            </w:r>
+          </w:p>
+        </w:tc>
+      </w:tr>
+    </w:tbl>
     <w:p>
       <w:pPr>
         <w:pStyle w:val="Heading1"/>

</xml_diff>